<commit_message>
Atualizar regulamento: jantar 5 últimos pagam, mata-mata digital, suspense no jantar (Art.13)
Co-authored-by: Cursor <cursoragent@cursor.com>
</commit_message>
<xml_diff>
--- a/Regulamento_Predictor_Mundial_2026.docx
+++ b/Regulamento_Predictor_Mundial_2026.docx
@@ -447,7 +447,7 @@
           <w:color w:val="444444"/>
           <w:sz w:val="19"/>
         </w:rPr>
-        <w:t>— Obrigações do Último Classificado</w:t>
+        <w:t>— Obrigações dos Últimos 5 Classificados</w:t>
       </w:r>
     </w:p>
     <w:p>
@@ -495,7 +495,7 @@
           <w:color w:val="444444"/>
           <w:sz w:val="19"/>
         </w:rPr>
-        <w:t>— Reclamações e Resolução de Disputas</w:t>
+        <w:t>— Suspense — Revelação dos Resultados no Jantar</w:t>
       </w:r>
     </w:p>
     <w:p>
@@ -519,7 +519,7 @@
           <w:color w:val="444444"/>
           <w:sz w:val="19"/>
         </w:rPr>
-        <w:t>— Base de Dados e Verificação dos Prognósticos</w:t>
+        <w:t>— Reclamações e Resolução de Disputas</w:t>
       </w:r>
     </w:p>
     <w:p>
@@ -543,7 +543,7 @@
           <w:color w:val="444444"/>
           <w:sz w:val="19"/>
         </w:rPr>
-        <w:t>— Alteração de Prognósticos</w:t>
+        <w:t>— Base de Dados e Verificação dos Prognósticos</w:t>
       </w:r>
     </w:p>
     <w:p>
@@ -567,7 +567,7 @@
           <w:color w:val="444444"/>
           <w:sz w:val="19"/>
         </w:rPr>
-        <w:t>— Jogos Cancelados, Adiados ou com Resultado Anulado</w:t>
+        <w:t>— Alteração de Prognósticos</w:t>
       </w:r>
     </w:p>
     <w:p>
@@ -591,7 +591,7 @@
           <w:color w:val="444444"/>
           <w:sz w:val="19"/>
         </w:rPr>
-        <w:t>— Conduta e Fair-Play</w:t>
+        <w:t>— Jogos Cancelados, Adiados ou com Resultado Anulado</w:t>
       </w:r>
     </w:p>
     <w:p>
@@ -615,7 +615,7 @@
           <w:color w:val="444444"/>
           <w:sz w:val="19"/>
         </w:rPr>
-        <w:t>— Privacidade e Uso dos Dados</w:t>
+        <w:t>— Conduta e Fair-Play</w:t>
       </w:r>
     </w:p>
     <w:p>
@@ -631,6 +631,30 @@
           <w:sz w:val="19"/>
         </w:rPr>
         <w:t xml:space="preserve">Artigo 19.º  </w:t>
+      </w:r>
+      <w:r>
+        <w:rPr>
+          <w:b w:val="0"/>
+          <w:i w:val="0"/>
+          <w:color w:val="444444"/>
+          <w:sz w:val="19"/>
+        </w:rPr>
+        <w:t>— Privacidade e Uso dos Dados</w:t>
+      </w:r>
+    </w:p>
+    <w:p>
+      <w:pPr>
+        <w:spacing w:before="0" w:after="20" w:lineRule="exact" w:line="270"/>
+        <w:jc w:val="left"/>
+      </w:pPr>
+      <w:r>
+        <w:rPr>
+          <w:b/>
+          <w:i w:val="0"/>
+          <w:color w:val="1A3A6E"/>
+          <w:sz w:val="19"/>
+        </w:rPr>
+        <w:t xml:space="preserve">Artigo 20.º  </w:t>
       </w:r>
       <w:r>
         <w:rPr>
@@ -1153,7 +1177,7 @@
           <w:color w:val="111111"/>
           <w:sz w:val="20"/>
         </w:rPr>
-        <w:t>3.3  Para os jogos do mata-mata, os participantes registam os seus prognósticos através da aplicação digital do Predictor, disponível localmente.</w:t>
+        <w:t>3.3  Para os jogos do mata-mata, os prognósticos são recolhidos digitalmente. O organizador envia a cada participante, por mensagem digital (WhatsApp ou equivalente), os jogos de cada fase eliminatória antes do seu início. Cada participante responde com os seus prognósticos (resultado aos 90 minutos e equipa apurada) para cada jogo. O organizador regista as respostas na aplicação do Predictor.</w:t>
       </w:r>
     </w:p>
     <w:p>
@@ -1168,7 +1192,22 @@
           <w:color w:val="111111"/>
           <w:sz w:val="20"/>
         </w:rPr>
-        <w:t>3.4  A validade dos prognósticos está condicionada à verificação descrita no Artigo 14.º.</w:t>
+        <w:t>3.4  O envio dos prognósticos do mata-mata deve ser feito dentro do prazo comunicado pelo organizador para cada fase. Respostas fora do prazo equivalem a prognóstico em branco (0 pontos) para os jogos em causa.</w:t>
+      </w:r>
+    </w:p>
+    <w:p>
+      <w:pPr>
+        <w:spacing w:before="0" w:after="60" w:lineRule="exact" w:line="270"/>
+        <w:jc w:val="left"/>
+      </w:pPr>
+      <w:r>
+        <w:rPr>
+          <w:b w:val="0"/>
+          <w:i w:val="0"/>
+          <w:color w:val="111111"/>
+          <w:sz w:val="20"/>
+        </w:rPr>
+        <w:t>3.5  A validade dos prognósticos está condicionada à verificação descrita no Artigo 14.º.</w:t>
       </w:r>
     </w:p>
     <w:tbl>
@@ -4825,12 +4864,12 @@
           <w:color w:val="111111"/>
           <w:sz w:val="20"/>
         </w:rPr>
-        <w:t>10.1  O prémio simbólico do Predictor é o reconhecimento público do 1.º classificado. A verdadeira aposta é a penalização do último classificado.</w:t>
+        <w:t>10.1  O prémio do Predictor é o reconhecimento público dos 5 melhores classificados e, sobretudo, o jantar pago pelos 5 piores. A competição divide-se entre vencedores e pagadores.</w:t>
       </w:r>
     </w:p>
     <w:p>
       <w:pPr>
-        <w:spacing w:before="0" w:after="60" w:lineRule="exact" w:line="270"/>
+        <w:spacing w:before="80" w:after="60" w:lineRule="exact" w:line="270"/>
         <w:jc w:val="left"/>
       </w:pPr>
       <w:r>
@@ -4840,22 +4879,7 @@
           <w:color w:val="111111"/>
           <w:sz w:val="20"/>
         </w:rPr>
-        <w:t>10.2  O participante que terminar em ÚLTIMO LUGAR (10.ª posição) na classificação final é obrigado a pagar o jantar de grupo — um jantar a ser organizado e realizado após o encerramento do Campeonato do Mundo 2026.</w:t>
-      </w:r>
-    </w:p>
-    <w:p>
-      <w:pPr>
-        <w:spacing w:before="80" w:after="60" w:lineRule="exact" w:line="270"/>
-        <w:jc w:val="left"/>
-      </w:pPr>
-      <w:r>
-        <w:rPr>
-          <w:b w:val="0"/>
-          <w:i w:val="0"/>
-          <w:color w:val="111111"/>
-          <w:sz w:val="20"/>
-        </w:rPr>
-        <w:t>10.3  O jantar inclui:</w:t>
+        <w:t>10.2  Sistema de pagamento do jantar:</w:t>
       </w:r>
     </w:p>
     <w:p>
@@ -4880,7 +4904,7 @@
           <w:color w:val="111111"/>
           <w:sz w:val="20"/>
         </w:rPr>
-        <w:t>Refeição completa para todos os 10 participantes (entrada, prato principal e sobremesa).</w:t>
+        <w:t>Os 5 participantes classificados nas posições 6.ª a 10.ª (os últimos 5) pagam o jantar.</w:t>
       </w:r>
     </w:p>
     <w:p>
@@ -4905,7 +4929,7 @@
           <w:color w:val="111111"/>
           <w:sz w:val="20"/>
         </w:rPr>
-        <w:t>Bebidas não alcoólicas incluídas.</w:t>
+        <w:t>Os 5 participantes classificados nas posições 1.ª a 5.ª (os primeiros 5) jantam gratuitamente.</w:t>
       </w:r>
     </w:p>
     <w:p>
@@ -4930,7 +4954,22 @@
           <w:color w:val="111111"/>
           <w:sz w:val="20"/>
         </w:rPr>
-        <w:t>Bebidas alcoólicas pagas individualmente por cada participante.</w:t>
+        <w:t>O custo total do jantar é dividido em partes iguais pelos 5 últimos classificados.</w:t>
+      </w:r>
+    </w:p>
+    <w:p>
+      <w:pPr>
+        <w:spacing w:before="80" w:after="60" w:lineRule="exact" w:line="270"/>
+        <w:jc w:val="left"/>
+      </w:pPr>
+      <w:r>
+        <w:rPr>
+          <w:b w:val="0"/>
+          <w:i w:val="0"/>
+          <w:color w:val="111111"/>
+          <w:sz w:val="20"/>
+        </w:rPr>
+        <w:t>10.3  O jantar inclui, por cada participante:</w:t>
       </w:r>
     </w:p>
     <w:p>
@@ -4955,14 +4994,24 @@
           <w:color w:val="111111"/>
           <w:sz w:val="20"/>
         </w:rPr>
-        <w:t>O restaurante é escolhido por votação simples (maioria) dos participantes, excluindo o último classificado, que não tem direito de voto na escolha do local.</w:t>
+        <w:t>Entrada.</w:t>
       </w:r>
     </w:p>
     <w:p>
       <w:pPr>
-        <w:spacing w:before="80" w:after="60" w:lineRule="exact" w:line="270"/>
+        <w:spacing w:before="0" w:after="20" w:lineRule="exact" w:line="270"/>
+        <w:ind w:left="397"/>
         <w:jc w:val="left"/>
       </w:pPr>
+      <w:r>
+        <w:rPr>
+          <w:b/>
+          <w:i w:val="0"/>
+          <w:color w:val="1A3A6E"/>
+          <w:sz w:val="20"/>
+        </w:rPr>
+        <w:t xml:space="preserve">•  </w:t>
+      </w:r>
       <w:r>
         <w:rPr>
           <w:b w:val="0"/>
@@ -4970,14 +5019,24 @@
           <w:color w:val="111111"/>
           <w:sz w:val="20"/>
         </w:rPr>
-        <w:t>10.4  O último classificado paga o jantar na totalidade, sem divisão de custos. Não existe teto máximo de despesa estabelecido, sendo assumido que o grupo escolherá um restaurante razoável e adequado às circunstâncias.</w:t>
+        <w:t>Prato principal.</w:t>
       </w:r>
     </w:p>
     <w:p>
       <w:pPr>
-        <w:spacing w:before="0" w:after="60" w:lineRule="exact" w:line="270"/>
+        <w:spacing w:before="0" w:after="20" w:lineRule="exact" w:line="270"/>
+        <w:ind w:left="397"/>
         <w:jc w:val="left"/>
       </w:pPr>
+      <w:r>
+        <w:rPr>
+          <w:b/>
+          <w:i w:val="0"/>
+          <w:color w:val="1A3A6E"/>
+          <w:sz w:val="20"/>
+        </w:rPr>
+        <w:t xml:space="preserve">•  </w:t>
+      </w:r>
       <w:r>
         <w:rPr>
           <w:b w:val="0"/>
@@ -4985,7 +5044,92 @@
           <w:color w:val="111111"/>
           <w:sz w:val="20"/>
         </w:rPr>
-        <w:t>10.5  O 1.º classificado tem direito de escolher a data do jantar, em coordenação com a disponibilidade geral do grupo.</w:t>
+        <w:t>Bebidas (água, refrigerantes, vinho ou cerveja — incluídas na refeição).</w:t>
+      </w:r>
+    </w:p>
+    <w:p>
+      <w:pPr>
+        <w:spacing w:before="0" w:after="20" w:lineRule="exact" w:line="270"/>
+        <w:ind w:left="397"/>
+        <w:jc w:val="left"/>
+      </w:pPr>
+      <w:r>
+        <w:rPr>
+          <w:b/>
+          <w:i w:val="0"/>
+          <w:color w:val="1A3A6E"/>
+          <w:sz w:val="20"/>
+        </w:rPr>
+        <w:t xml:space="preserve">•  </w:t>
+      </w:r>
+      <w:r>
+        <w:rPr>
+          <w:b w:val="0"/>
+          <w:i w:val="0"/>
+          <w:color w:val="111111"/>
+          <w:sz w:val="20"/>
+        </w:rPr>
+        <w:t>Sobremesa.</w:t>
+      </w:r>
+    </w:p>
+    <w:p>
+      <w:pPr>
+        <w:spacing w:before="80" w:after="60" w:lineRule="exact" w:line="270"/>
+        <w:jc w:val="left"/>
+      </w:pPr>
+      <w:r>
+        <w:rPr>
+          <w:b w:val="0"/>
+          <w:i w:val="0"/>
+          <w:color w:val="111111"/>
+          <w:sz w:val="20"/>
+        </w:rPr>
+        <w:t>10.4  Bebidas adicionais ou fora do menu combinado são pagas individualmente, pelos vencedores ou pelos pagadores, consoante quem as consuma.</w:t>
+      </w:r>
+    </w:p>
+    <w:p>
+      <w:pPr>
+        <w:spacing w:before="0" w:after="60" w:lineRule="exact" w:line="270"/>
+        <w:jc w:val="left"/>
+      </w:pPr>
+      <w:r>
+        <w:rPr>
+          <w:b w:val="0"/>
+          <w:i w:val="0"/>
+          <w:color w:val="111111"/>
+          <w:sz w:val="20"/>
+        </w:rPr>
+        <w:t>10.5  O restaurante é escolhido por votação simples (maioria) dos 5 primeiros classificados. Os 5 últimos classificados não têm direito de voto na escolha do local.</w:t>
+      </w:r>
+    </w:p>
+    <w:p>
+      <w:pPr>
+        <w:spacing w:before="80" w:after="60" w:lineRule="exact" w:line="270"/>
+        <w:jc w:val="left"/>
+      </w:pPr>
+      <w:r>
+        <w:rPr>
+          <w:b w:val="0"/>
+          <w:i w:val="0"/>
+          <w:color w:val="111111"/>
+          <w:sz w:val="20"/>
+        </w:rPr>
+        <w:t>10.6  O 1.º classificado tem direito de escolher a data do jantar, em coordenação com a disponibilidade geral do grupo.</w:t>
+      </w:r>
+    </w:p>
+    <w:p>
+      <w:pPr>
+        <w:spacing w:before="0" w:after="60" w:lineRule="exact" w:line="270"/>
+        <w:jc w:val="left"/>
+      </w:pPr>
+      <w:r>
+        <w:rPr>
+          <w:b w:val="0"/>
+          <w:i w:val="0"/>
+          <w:color w:val="111111"/>
+          <w:sz w:val="20"/>
+        </w:rPr>
+        <w:t>10.7  Cada um dos 5 últimos classificados paga a sua quota-parte no próprio dia do jantar, antes de sair do restaurante. Não são aceites transferências diferidas salvo acordo expresso dos 5 primeiros classificados.</w:t>
       </w:r>
     </w:p>
     <w:tbl>
@@ -5051,7 +5195,7 @@
                 <w:color w:val="1A3A6E"/>
                 <w:sz w:val="19"/>
               </w:rPr>
-              <w:t>Situação:</w:t>
+              <w:t>1.º ao 5.º lugar:</w:t>
             </w:r>
             <w:r>
               <w:rPr>
@@ -5060,7 +5204,7 @@
                 <w:color w:val="111111"/>
                 <w:sz w:val="19"/>
               </w:rPr>
-              <w:t xml:space="preserve">  João Silva termina em 10.º lugar com 85 pontos.</w:t>
+              <w:t xml:space="preserve">  André, João Garcia, Hélio, Miguel, Luis — jantam de graça.</w:t>
             </w:r>
           </w:p>
         </w:tc>
@@ -5089,7 +5233,7 @@
                 <w:color w:val="1A3A6E"/>
                 <w:sz w:val="19"/>
               </w:rPr>
-              <w:t>Consequência:</w:t>
+              <w:t>6.º ao 10.º lugar:</w:t>
             </w:r>
             <w:r>
               <w:rPr>
@@ -5098,7 +5242,7 @@
                 <w:color w:val="111111"/>
                 <w:sz w:val="19"/>
               </w:rPr>
-              <w:t xml:space="preserve">  João Silva paga o jantar completo para os 10 participantes.</w:t>
+              <w:t xml:space="preserve">  Vítor, Paulo, Ricardo, Rúben, José — pagam o jantar.</w:t>
             </w:r>
           </w:p>
         </w:tc>
@@ -5127,6 +5271,44 @@
                 <w:color w:val="1A3A6E"/>
                 <w:sz w:val="19"/>
               </w:rPr>
+              <w:t>Divisão do custo:</w:t>
+            </w:r>
+            <w:r>
+              <w:rPr>
+                <w:b w:val="0"/>
+                <w:i w:val="0"/>
+                <w:color w:val="111111"/>
+                <w:sz w:val="19"/>
+              </w:rPr>
+              <w:t xml:space="preserve">  Conta total ÷ 5 = quota de cada um dos últimos 5.</w:t>
+            </w:r>
+          </w:p>
+        </w:tc>
+      </w:tr>
+      <w:tr>
+        <w:tc>
+          <w:tcPr>
+            <w:tcW w:type="dxa" w:w="9072"/>
+            <w:shd w:val="clear" w:color="auto" w:fill="FFFFFF"/>
+            <w:tcMar>
+              <w:top w:w="40" w:type="dxa"/>
+              <w:bottom w:w="40" w:type="dxa"/>
+              <w:left w:w="120" w:type="dxa"/>
+              <w:right w:w="100" w:type="dxa"/>
+            </w:tcMar>
+          </w:tcPr>
+          <w:p>
+            <w:pPr>
+              <w:spacing w:before="0" w:after="0" w:lineRule="exact" w:line="270"/>
+              <w:jc w:val="left"/>
+            </w:pPr>
+            <w:r>
+              <w:rPr>
+                <w:b/>
+                <w:i w:val="0"/>
+                <w:color w:val="1A3A6E"/>
+                <w:sz w:val="19"/>
+              </w:rPr>
               <w:t>Escolha do restaurante:</w:t>
             </w:r>
             <w:r>
@@ -5136,7 +5318,7 @@
                 <w:color w:val="111111"/>
                 <w:sz w:val="19"/>
               </w:rPr>
-              <w:t xml:space="preserve">  Votação dos 9 participantes restantes (João não vota).</w:t>
+              <w:t xml:space="preserve">  Votação dos 5 primeiros (os últimos não votam).</w:t>
             </w:r>
           </w:p>
         </w:tc>
@@ -5145,7 +5327,7 @@
         <w:tc>
           <w:tcPr>
             <w:tcW w:type="dxa" w:w="9072"/>
-            <w:shd w:val="clear" w:color="auto" w:fill="FFFFFF"/>
+            <w:shd w:val="clear" w:color="auto" w:fill="F2F5F9"/>
             <w:tcMar>
               <w:top w:w="40" w:type="dxa"/>
               <w:bottom w:w="40" w:type="dxa"/>
@@ -5198,7 +5380,7 @@
           <w:color w:val="1A3A6E"/>
           <w:sz w:val="22"/>
         </w:rPr>
-        <w:t>Artigo 11.º — Obrigações do Último Classificado</w:t>
+        <w:t>Artigo 11.º — Obrigações dos Últimos 5 Classificados</w:t>
       </w:r>
     </w:p>
     <w:p>
@@ -5213,7 +5395,7 @@
           <w:color w:val="111111"/>
           <w:sz w:val="20"/>
         </w:rPr>
-        <w:t>11.1  O último classificado assume as seguintes obrigações específicas:</w:t>
+        <w:t>11.1  Cada um dos 5 últimos classificados (posições 6.ª a 10.ª) assume as seguintes obrigações:</w:t>
       </w:r>
     </w:p>
     <w:p>
@@ -5263,7 +5445,7 @@
           <w:color w:val="111111"/>
           <w:sz w:val="20"/>
         </w:rPr>
-        <w:t>Acordar o restaurante escolhido pelo grupo sem objeções.</w:t>
+        <w:t>Aceitar o restaurante escolhido pelos 5 primeiros sem objeções.</w:t>
       </w:r>
     </w:p>
     <w:p>
@@ -5288,7 +5470,7 @@
           <w:color w:val="111111"/>
           <w:sz w:val="20"/>
         </w:rPr>
-        <w:t>Pagar a conta integralmente, incluindo todas as despesas da refeição.</w:t>
+        <w:t>Pagar a sua quota-parte da conta no próprio dia do jantar.</w:t>
       </w:r>
     </w:p>
     <w:p>
@@ -5353,7 +5535,7 @@
           <w:color w:val="111111"/>
           <w:sz w:val="20"/>
         </w:rPr>
-        <w:t>11.2  O último classificado tem pleno direito de participar no jantar e desfrutar da noite como qualquer outro convidado. A penalização é financeira, não social.</w:t>
+        <w:t>11.2  Os últimos 5 classificados têm pleno direito de participar no jantar e desfrutar da noite como qualquer outro convidado. A penalização é financeira, não social.</w:t>
       </w:r>
     </w:p>
     <w:p>
@@ -5368,7 +5550,7 @@
           <w:color w:val="111111"/>
           <w:sz w:val="20"/>
         </w:rPr>
-        <w:t>11.3  O pagamento deve ser efetuado no próprio dia do jantar, antes de sair do restaurante, diretamente ao estabelecimento. Não são aceites transferências diferidas salvo acordo expresso de todos os participantes.</w:t>
+        <w:t>11.3  Em caso de desistência de algum dos 5 primeiros (que jantam de graça), a sua vaga não é transferível nem gera redução no valor pago pelos últimos 5.</w:t>
       </w:r>
     </w:p>
     <w:p>
@@ -5398,12 +5580,12 @@
           <w:color w:val="111111"/>
           <w:sz w:val="20"/>
         </w:rPr>
-        <w:t>12.1  A presença no jantar é altamente encorajada para todos os participantes, mas voluntária para os classificados do 1.º ao 9.º lugar.</w:t>
+        <w:t>12.1  A presença no jantar é voluntária para os 5 primeiros classificados. Se algum dos 5 primeiros não puder comparecer, a sua quota é simplesmente não paga — os últimos 5 não ficam beneficiados por isso.</w:t>
       </w:r>
     </w:p>
     <w:p>
       <w:pPr>
-        <w:spacing w:before="0" w:after="60" w:lineRule="exact" w:line="270"/>
+        <w:spacing w:before="80" w:after="60" w:lineRule="exact" w:line="270"/>
         <w:jc w:val="left"/>
       </w:pPr>
       <w:r>
@@ -5413,7 +5595,7 @@
           <w:color w:val="111111"/>
           <w:sz w:val="20"/>
         </w:rPr>
-        <w:t>12.2  Para o ÚLTIMO CLASSIFICADO, o jantar é obrigatório sob pena das sanções previstas neste artigo.</w:t>
+        <w:t>12.2  Para os 5 ÚLTIMOS CLASSIFICADOS, a presença é obrigatória sob pena das sanções previstas neste artigo.</w:t>
       </w:r>
     </w:p>
     <w:p>
@@ -5428,7 +5610,7 @@
           <w:color w:val="111111"/>
           <w:sz w:val="20"/>
         </w:rPr>
-        <w:t>12.3  Se o último classificado não comparecer ao jantar SEM justificação válida (ver n.º 12.4), aplica-se a seguinte penalização alternativa:</w:t>
+        <w:t>12.3  Se algum dos 5 últimos não comparecer SEM justificação válida (ver n.º 12.5), aplica-se:</w:t>
       </w:r>
     </w:p>
     <w:p>
@@ -5453,7 +5635,7 @@
           <w:color w:val="111111"/>
           <w:sz w:val="20"/>
         </w:rPr>
-        <w:t>Pagamento por transferência bancária do valor total do jantar ao 1.º classificado, que redistribui ao grupo consoante os custos reais.</w:t>
+        <w:t>Pagamento por transferência bancária da sua quota-parte ao 1.º classificado, que redistribui ao grupo consoante os custos reais.</w:t>
       </w:r>
     </w:p>
     <w:p>
@@ -5478,7 +5660,7 @@
           <w:color w:val="111111"/>
           <w:sz w:val="20"/>
         </w:rPr>
-        <w:t>Publicação de mensagem de rendição no grupo de WhatsApp do grupo, reconhecendo a derrota de forma explícita.</w:t>
+        <w:t>Publicação de mensagem de rendição no grupo de WhatsApp, reconhecendo publicamente a derrota.</w:t>
       </w:r>
     </w:p>
     <w:p>
@@ -5503,7 +5685,7 @@
           <w:color w:val="111111"/>
           <w:sz w:val="20"/>
         </w:rPr>
-        <w:t>Organização de um segundo jantar em data futura, a ser definida pelo grupo.</w:t>
+        <w:t>Obrigação de organizar um segundo jantar em data futura, a definir pelo grupo.</w:t>
       </w:r>
     </w:p>
     <w:p>
@@ -5518,7 +5700,22 @@
           <w:color w:val="111111"/>
           <w:sz w:val="20"/>
         </w:rPr>
-        <w:t>12.4  Constituem justificações válidas para ausência:</w:t>
+        <w:t>12.4  Se vários dos 5 últimos faltarem sem justificação, cada um enfrenta as penalizações acima de forma individual e cumulativa.</w:t>
+      </w:r>
+    </w:p>
+    <w:p>
+      <w:pPr>
+        <w:spacing w:before="80" w:after="60" w:lineRule="exact" w:line="270"/>
+        <w:jc w:val="left"/>
+      </w:pPr>
+      <w:r>
+        <w:rPr>
+          <w:b w:val="0"/>
+          <w:i w:val="0"/>
+          <w:color w:val="111111"/>
+          <w:sz w:val="20"/>
+        </w:rPr>
+        <w:t>12.5  Constituem justificações válidas para ausência:</w:t>
       </w:r>
     </w:p>
     <w:p>
@@ -5618,7 +5815,7 @@
           <w:color w:val="111111"/>
           <w:sz w:val="20"/>
         </w:rPr>
-        <w:t>Qualquer outro motivo aceite por unanimidade dos restantes participantes.</w:t>
+        <w:t>Qualquer outro motivo aceite por unanimidade dos 5 primeiros classificados.</w:t>
       </w:r>
     </w:p>
     <w:p>
@@ -5633,7 +5830,7 @@
           <w:color w:val="111111"/>
           <w:sz w:val="20"/>
         </w:rPr>
-        <w:t>12.5  Em caso de ausência justificada, o jantar é remarcado para data conveniente para a maioria. O último classificado continua obrigado a pagar.</w:t>
+        <w:t>12.6  Em caso de ausência justificada de qualquer dos 5 últimos, o jantar é remarcado para data conveniente para a maioria. A obrigação de pagamento mantém-se.</w:t>
       </w:r>
     </w:p>
     <w:tbl>
@@ -5679,7 +5876,7 @@
                 <w:color w:val="444444"/>
                 <w:sz w:val="19"/>
               </w:rPr>
-              <w:t>«Não me apetece sair» e «tenho muito trabalho» não constituem justificações válidas. O regulamento é claro: o jantar é uma obrigação assumida no momento da inscrição.</w:t>
+              <w:t>«Não me apetece sair» e «tenho muito trabalho» não constituem justificações válidas. O jantar é uma obrigação assumida no momento da inscrição e aceite neste regulamento.</w:t>
             </w:r>
           </w:p>
         </w:tc>
@@ -5703,7 +5900,525 @@
           <w:color w:val="1A3A6E"/>
           <w:sz w:val="22"/>
         </w:rPr>
-        <w:t>Artigo 13.º — Reclamações e Resolução de Disputas</w:t>
+        <w:t>Artigo 13.º — Suspense — Revelação dos Resultados no Jantar</w:t>
+      </w:r>
+    </w:p>
+    <w:p>
+      <w:pPr>
+        <w:spacing w:before="0" w:after="60" w:lineRule="exact" w:line="270"/>
+        <w:jc w:val="left"/>
+      </w:pPr>
+      <w:r>
+        <w:rPr>
+          <w:b w:val="0"/>
+          <w:i w:val="0"/>
+          <w:color w:val="111111"/>
+          <w:sz w:val="20"/>
+        </w:rPr>
+        <w:t>13.1  Um dos momentos centrais do Predictor é a revelação pública e dramática da classificação final e dos prognósticos individuais de cada participante. Para preservar o suspense e maximizar o entretenimento no jantar, aplicam-se as seguintes regras de confidencialidade.</w:t>
+      </w:r>
+    </w:p>
+    <w:p>
+      <w:pPr>
+        <w:spacing w:before="80" w:after="60" w:lineRule="exact" w:line="270"/>
+        <w:jc w:val="left"/>
+      </w:pPr>
+      <w:r>
+        <w:rPr>
+          <w:b w:val="0"/>
+          <w:i w:val="0"/>
+          <w:color w:val="111111"/>
+          <w:sz w:val="20"/>
+        </w:rPr>
+        <w:t>13.2  Até ao momento da revelação no jantar:</w:t>
+      </w:r>
+    </w:p>
+    <w:p>
+      <w:pPr>
+        <w:spacing w:before="0" w:after="20" w:lineRule="exact" w:line="270"/>
+        <w:ind w:left="397"/>
+        <w:jc w:val="left"/>
+      </w:pPr>
+      <w:r>
+        <w:rPr>
+          <w:b/>
+          <w:i w:val="0"/>
+          <w:color w:val="1A3A6E"/>
+          <w:sz w:val="20"/>
+        </w:rPr>
+        <w:t xml:space="preserve">•  </w:t>
+      </w:r>
+      <w:r>
+        <w:rPr>
+          <w:b w:val="0"/>
+          <w:i w:val="0"/>
+          <w:color w:val="111111"/>
+          <w:sz w:val="20"/>
+        </w:rPr>
+        <w:t>Nenhum participante conhece os prognósticos detalhados dos outros participantes.</w:t>
+      </w:r>
+    </w:p>
+    <w:p>
+      <w:pPr>
+        <w:spacing w:before="0" w:after="20" w:lineRule="exact" w:line="270"/>
+        <w:ind w:left="397"/>
+        <w:jc w:val="left"/>
+      </w:pPr>
+      <w:r>
+        <w:rPr>
+          <w:b/>
+          <w:i w:val="0"/>
+          <w:color w:val="1A3A6E"/>
+          <w:sz w:val="20"/>
+        </w:rPr>
+        <w:t xml:space="preserve">•  </w:t>
+      </w:r>
+      <w:r>
+        <w:rPr>
+          <w:b w:val="0"/>
+          <w:i w:val="0"/>
+          <w:color w:val="111111"/>
+          <w:sz w:val="20"/>
+        </w:rPr>
+        <w:t>O organizador não divulga a classificação provisória nem os pontos individuais de cada participante a terceiros.</w:t>
+      </w:r>
+    </w:p>
+    <w:p>
+      <w:pPr>
+        <w:spacing w:before="0" w:after="20" w:lineRule="exact" w:line="270"/>
+        <w:ind w:left="397"/>
+        <w:jc w:val="left"/>
+      </w:pPr>
+      <w:r>
+        <w:rPr>
+          <w:b/>
+          <w:i w:val="0"/>
+          <w:color w:val="1A3A6E"/>
+          <w:sz w:val="20"/>
+        </w:rPr>
+        <w:t xml:space="preserve">•  </w:t>
+      </w:r>
+      <w:r>
+        <w:rPr>
+          <w:b w:val="0"/>
+          <w:i w:val="0"/>
+          <w:color w:val="111111"/>
+          <w:sz w:val="20"/>
+        </w:rPr>
+        <w:t>A aplicação do Predictor pode ser consultada pelo organizador, mas os dados não são partilhados publicamente antes do jantar.</w:t>
+      </w:r>
+    </w:p>
+    <w:p>
+      <w:pPr>
+        <w:spacing w:before="80" w:after="60" w:lineRule="exact" w:line="270"/>
+        <w:jc w:val="left"/>
+      </w:pPr>
+      <w:r>
+        <w:rPr>
+          <w:b w:val="0"/>
+          <w:i w:val="0"/>
+          <w:color w:val="111111"/>
+          <w:sz w:val="20"/>
+        </w:rPr>
+        <w:t>13.3  A revelação dos resultados é feita a meio do jantar, num momento cerimonial organizado pelo 1.º classificado ou pelo organizador, da seguinte forma sugerida:</w:t>
+      </w:r>
+    </w:p>
+    <w:p>
+      <w:pPr>
+        <w:spacing w:before="0" w:after="40" w:lineRule="exact" w:line="270"/>
+        <w:ind w:left="397"/>
+        <w:jc w:val="left"/>
+      </w:pPr>
+      <w:r>
+        <w:rPr>
+          <w:b/>
+          <w:i w:val="0"/>
+          <w:color w:val="1A3A6E"/>
+          <w:sz w:val="20"/>
+        </w:rPr>
+        <w:t xml:space="preserve">1.  </w:t>
+      </w:r>
+      <w:r>
+        <w:rPr>
+          <w:b w:val="0"/>
+          <w:i w:val="0"/>
+          <w:color w:val="111111"/>
+          <w:sz w:val="20"/>
+        </w:rPr>
+        <w:t>Anúncio da pontuação total de cada participante, do 10.º para o 1.º lugar.</w:t>
+      </w:r>
+    </w:p>
+    <w:p>
+      <w:pPr>
+        <w:spacing w:before="0" w:after="40" w:lineRule="exact" w:line="270"/>
+        <w:ind w:left="397"/>
+        <w:jc w:val="left"/>
+      </w:pPr>
+      <w:r>
+        <w:rPr>
+          <w:b/>
+          <w:i w:val="0"/>
+          <w:color w:val="1A3A6E"/>
+          <w:sz w:val="20"/>
+        </w:rPr>
+        <w:t xml:space="preserve">2.  </w:t>
+      </w:r>
+      <w:r>
+        <w:rPr>
+          <w:b w:val="0"/>
+          <w:i w:val="0"/>
+          <w:color w:val="111111"/>
+          <w:sz w:val="20"/>
+        </w:rPr>
+        <w:t>Revelação dos prognósticos mais marcantes (mais exatos, mais errados, mais ousados).</w:t>
+      </w:r>
+    </w:p>
+    <w:p>
+      <w:pPr>
+        <w:spacing w:before="0" w:after="40" w:lineRule="exact" w:line="270"/>
+        <w:ind w:left="397"/>
+        <w:jc w:val="left"/>
+      </w:pPr>
+      <w:r>
+        <w:rPr>
+          <w:b/>
+          <w:i w:val="0"/>
+          <w:color w:val="1A3A6E"/>
+          <w:sz w:val="20"/>
+        </w:rPr>
+        <w:t xml:space="preserve">3.  </w:t>
+      </w:r>
+      <w:r>
+        <w:rPr>
+          <w:b w:val="0"/>
+          <w:i w:val="0"/>
+          <w:color w:val="111111"/>
+          <w:sz w:val="20"/>
+        </w:rPr>
+        <w:t>Entrega simbólica do troféu ou reconhecimento ao 1.º classificado.</w:t>
+      </w:r>
+    </w:p>
+    <w:p>
+      <w:pPr>
+        <w:spacing w:before="0" w:after="40" w:lineRule="exact" w:line="270"/>
+        <w:ind w:left="397"/>
+        <w:jc w:val="left"/>
+      </w:pPr>
+      <w:r>
+        <w:rPr>
+          <w:b/>
+          <w:i w:val="0"/>
+          <w:color w:val="1A3A6E"/>
+          <w:sz w:val="20"/>
+        </w:rPr>
+        <w:t xml:space="preserve">4.  </w:t>
+      </w:r>
+      <w:r>
+        <w:rPr>
+          <w:b w:val="0"/>
+          <w:i w:val="0"/>
+          <w:color w:val="111111"/>
+          <w:sz w:val="20"/>
+        </w:rPr>
+        <w:t>Momento de 'shame' saudável dos 5 últimos classificados, que nessa altura já sabem quem paga.</w:t>
+      </w:r>
+    </w:p>
+    <w:p>
+      <w:pPr>
+        <w:spacing w:before="80" w:after="60" w:lineRule="exact" w:line="270"/>
+        <w:jc w:val="left"/>
+      </w:pPr>
+      <w:r>
+        <w:rPr>
+          <w:b w:val="0"/>
+          <w:i w:val="0"/>
+          <w:color w:val="111111"/>
+          <w:sz w:val="20"/>
+        </w:rPr>
+        <w:t>13.4  A ordem e o formato da revelação podem ser adaptados pelo organizador consoante o ambiente e dinâmica do grupo no jantar.</w:t>
+      </w:r>
+    </w:p>
+    <w:p>
+      <w:pPr>
+        <w:spacing w:before="0" w:after="60" w:lineRule="exact" w:line="270"/>
+        <w:jc w:val="left"/>
+      </w:pPr>
+      <w:r>
+        <w:rPr>
+          <w:b w:val="0"/>
+          <w:i w:val="0"/>
+          <w:color w:val="111111"/>
+          <w:sz w:val="20"/>
+        </w:rPr>
+        <w:t>13.5  É expressamente proibido divulgar a classificação final ou os prognósticos detalhados de outros participantes antes do jantar, seja por WhatsApp, redes sociais ou qualquer outro meio. Quem o fizer estraga o suspense e merece olhares de reprovação geral.</w:t>
+      </w:r>
+    </w:p>
+    <w:tbl>
+      <w:tblPr>
+        <w:tblStyle w:val="TableGrid"/>
+        <w:tblW w:type="auto" w:w="0"/>
+        <w:tblLayout w:type="fixed"/>
+        <w:tblLook w:firstColumn="1" w:firstRow="1" w:lastColumn="0" w:lastRow="0" w:noHBand="0" w:noVBand="1" w:val="04A0"/>
+      </w:tblPr>
+      <w:tblGrid>
+        <w:gridCol w:w="9071"/>
+      </w:tblGrid>
+      <w:tr>
+        <w:tc>
+          <w:tcPr>
+            <w:tcW w:type="dxa" w:w="9072"/>
+            <w:shd w:val="clear" w:color="auto" w:fill="FEF9E7"/>
+            <w:tcMar>
+              <w:top w:w="80" w:type="dxa"/>
+              <w:bottom w:w="80" w:type="dxa"/>
+              <w:left w:w="100" w:type="dxa"/>
+              <w:right w:w="100" w:type="dxa"/>
+            </w:tcMar>
+          </w:tcPr>
+          <w:p>
+            <w:pPr>
+              <w:spacing w:before="0" w:after="0" w:lineRule="exact" w:line="270"/>
+              <w:jc w:val="left"/>
+            </w:pPr>
+            <w:r>
+              <w:rPr>
+                <w:b/>
+                <w:i w:val="0"/>
+                <w:color w:val="B86E00"/>
+                <w:sz w:val="19"/>
+              </w:rPr>
+              <w:t xml:space="preserve">⚠  Nota:  </w:t>
+            </w:r>
+            <w:r>
+              <w:rPr>
+                <w:b w:val="0"/>
+                <w:i w:val="0"/>
+                <w:color w:val="444444"/>
+                <w:sz w:val="19"/>
+              </w:rPr>
+              <w:t>O suspense é parte integrante da experiência. Saber que pode estar nos últimos 5 mas não saber ao certo até ao jantar torna a noite muito mais especial. Respeitem o processo.</w:t>
+            </w:r>
+          </w:p>
+        </w:tc>
+      </w:tr>
+    </w:tbl>
+    <w:p>
+      <w:pPr>
+        <w:spacing w:before="80" w:after="80" w:lineRule="exact" w:line="270"/>
+        <w:jc w:val="left"/>
+      </w:pPr>
+    </w:p>
+    <w:tbl>
+      <w:tblPr>
+        <w:tblStyle w:val="TableGrid"/>
+        <w:tblW w:type="auto" w:w="0"/>
+        <w:tblLayout w:type="fixed"/>
+        <w:tblLook w:firstColumn="1" w:firstRow="1" w:lastColumn="0" w:lastRow="0" w:noHBand="0" w:noVBand="1" w:val="04A0"/>
+      </w:tblPr>
+      <w:tblGrid>
+        <w:gridCol w:w="9071"/>
+      </w:tblGrid>
+      <w:tr>
+        <w:tc>
+          <w:tcPr>
+            <w:tcW w:type="dxa" w:w="9072"/>
+            <w:shd w:val="clear" w:color="auto" w:fill="1A3A6E"/>
+            <w:tcMar>
+              <w:top w:w="50" w:type="dxa"/>
+              <w:bottom w:w="50" w:type="dxa"/>
+              <w:left w:w="100" w:type="dxa"/>
+              <w:right w:w="100" w:type="dxa"/>
+            </w:tcMar>
+          </w:tcPr>
+          <w:p>
+            <w:pPr>
+              <w:spacing w:before="0" w:after="0" w:lineRule="exact" w:line="270"/>
+              <w:jc w:val="left"/>
+            </w:pPr>
+            <w:r>
+              <w:rPr>
+                <w:b/>
+                <w:i w:val="0"/>
+                <w:color w:val="FFFFFF"/>
+                <w:sz w:val="19"/>
+              </w:rPr>
+              <w:t>📌  Exemplo: Momento da Revelação no Jantar</w:t>
+            </w:r>
+          </w:p>
+        </w:tc>
+      </w:tr>
+      <w:tr>
+        <w:tc>
+          <w:tcPr>
+            <w:tcW w:type="dxa" w:w="9072"/>
+            <w:shd w:val="clear" w:color="auto" w:fill="F2F5F9"/>
+            <w:tcMar>
+              <w:top w:w="40" w:type="dxa"/>
+              <w:bottom w:w="40" w:type="dxa"/>
+              <w:left w:w="120" w:type="dxa"/>
+              <w:right w:w="100" w:type="dxa"/>
+            </w:tcMar>
+          </w:tcPr>
+          <w:p>
+            <w:pPr>
+              <w:spacing w:before="0" w:after="0" w:lineRule="exact" w:line="270"/>
+              <w:jc w:val="left"/>
+            </w:pPr>
+            <w:r>
+              <w:rPr>
+                <w:b/>
+                <w:i w:val="0"/>
+                <w:color w:val="1A3A6E"/>
+                <w:sz w:val="19"/>
+              </w:rPr>
+              <w:t>A meio do jantar:</w:t>
+            </w:r>
+            <w:r>
+              <w:rPr>
+                <w:b w:val="0"/>
+                <w:i w:val="0"/>
+                <w:color w:val="111111"/>
+                <w:sz w:val="19"/>
+              </w:rPr>
+              <w:t xml:space="preserve">  O organizador abre o portátil/telemóvel com a aplicação do Predictor.</w:t>
+            </w:r>
+          </w:p>
+        </w:tc>
+      </w:tr>
+      <w:tr>
+        <w:tc>
+          <w:tcPr>
+            <w:tcW w:type="dxa" w:w="9072"/>
+            <w:shd w:val="clear" w:color="auto" w:fill="FFFFFF"/>
+            <w:tcMar>
+              <w:top w:w="40" w:type="dxa"/>
+              <w:bottom w:w="40" w:type="dxa"/>
+              <w:left w:w="120" w:type="dxa"/>
+              <w:right w:w="100" w:type="dxa"/>
+            </w:tcMar>
+          </w:tcPr>
+          <w:p>
+            <w:pPr>
+              <w:spacing w:before="0" w:after="0" w:lineRule="exact" w:line="270"/>
+              <w:jc w:val="left"/>
+            </w:pPr>
+            <w:r>
+              <w:rPr>
+                <w:b/>
+                <w:i w:val="0"/>
+                <w:color w:val="1A3A6E"/>
+                <w:sz w:val="19"/>
+              </w:rPr>
+              <w:t>Anúncio dramático:</w:t>
+            </w:r>
+            <w:r>
+              <w:rPr>
+                <w:b w:val="0"/>
+                <w:i w:val="0"/>
+                <w:color w:val="111111"/>
+                <w:sz w:val="19"/>
+              </w:rPr>
+              <w:t xml:space="preserve">  «Em 10.º lugar, com X pontos... [pausa]... FULANO!»</w:t>
+            </w:r>
+          </w:p>
+        </w:tc>
+      </w:tr>
+      <w:tr>
+        <w:tc>
+          <w:tcPr>
+            <w:tcW w:type="dxa" w:w="9072"/>
+            <w:shd w:val="clear" w:color="auto" w:fill="F2F5F9"/>
+            <w:tcMar>
+              <w:top w:w="40" w:type="dxa"/>
+              <w:bottom w:w="40" w:type="dxa"/>
+              <w:left w:w="120" w:type="dxa"/>
+              <w:right w:w="100" w:type="dxa"/>
+            </w:tcMar>
+          </w:tcPr>
+          <w:p>
+            <w:pPr>
+              <w:spacing w:before="0" w:after="0" w:lineRule="exact" w:line="270"/>
+              <w:jc w:val="left"/>
+            </w:pPr>
+            <w:r>
+              <w:rPr>
+                <w:b/>
+                <w:i w:val="0"/>
+                <w:color w:val="1A3A6E"/>
+                <w:sz w:val="19"/>
+              </w:rPr>
+              <w:t>Reação esperada:</w:t>
+            </w:r>
+            <w:r>
+              <w:rPr>
+                <w:b w:val="0"/>
+                <w:i w:val="0"/>
+                <w:color w:val="111111"/>
+                <w:sz w:val="19"/>
+              </w:rPr>
+              <w:t xml:space="preserve">  Gargalhadas, espanto, reclamações amigáveis, alívio dos vencedores.</w:t>
+            </w:r>
+          </w:p>
+        </w:tc>
+      </w:tr>
+      <w:tr>
+        <w:tc>
+          <w:tcPr>
+            <w:tcW w:type="dxa" w:w="9072"/>
+            <w:shd w:val="clear" w:color="auto" w:fill="FFFFFF"/>
+            <w:tcMar>
+              <w:top w:w="40" w:type="dxa"/>
+              <w:bottom w:w="40" w:type="dxa"/>
+              <w:left w:w="120" w:type="dxa"/>
+              <w:right w:w="100" w:type="dxa"/>
+            </w:tcMar>
+          </w:tcPr>
+          <w:p>
+            <w:pPr>
+              <w:spacing w:before="0" w:after="0" w:lineRule="exact" w:line="270"/>
+              <w:jc w:val="left"/>
+            </w:pPr>
+            <w:r>
+              <w:rPr>
+                <w:b/>
+                <w:i w:val="0"/>
+                <w:color w:val="1A3A6E"/>
+                <w:sz w:val="19"/>
+              </w:rPr>
+              <w:t>Clímax:</w:t>
+            </w:r>
+            <w:r>
+              <w:rPr>
+                <w:b w:val="0"/>
+                <w:i w:val="0"/>
+                <w:color w:val="111111"/>
+                <w:sz w:val="19"/>
+              </w:rPr>
+              <w:t xml:space="preserve">  Revelação do 1.º classificado e dos prognósticos mais certeiros.</w:t>
+            </w:r>
+          </w:p>
+        </w:tc>
+      </w:tr>
+    </w:tbl>
+    <w:p>
+      <w:pPr>
+        <w:spacing w:before="80" w:after="0" w:lineRule="exact" w:line="270"/>
+        <w:jc w:val="left"/>
+      </w:pPr>
+    </w:p>
+    <w:p>
+      <w:pPr>
+        <w:spacing w:before="200" w:after="40" w:lineRule="exact" w:line="270"/>
+        <w:jc w:val="left"/>
+      </w:pPr>
+      <w:r>
+        <w:rPr>
+          <w:b/>
+          <w:i w:val="0"/>
+          <w:color w:val="1A3A6E"/>
+          <w:sz w:val="22"/>
+        </w:rPr>
+        <w:t>Artigo 14.º — Reclamações e Resolução de Disputas</w:t>
       </w:r>
     </w:p>
     <w:p>
@@ -6481,7 +7196,7 @@
           <w:color w:val="1A3A6E"/>
           <w:sz w:val="22"/>
         </w:rPr>
-        <w:t>Artigo 14.º — Base de Dados e Verificação dos Prognósticos</w:t>
+        <w:t>Artigo 15.º — Base de Dados e Verificação dos Prognósticos</w:t>
       </w:r>
     </w:p>
     <w:p>
@@ -6556,7 +7271,7 @@
           <w:color w:val="111111"/>
           <w:sz w:val="20"/>
         </w:rPr>
-        <w:t>14.5  Os prognósticos do mata-mata são registados diretamente na aplicação pelo participante. Não existe folha física para o mata-mata. O registo na aplicação é definitivo e irrevogável após o início do jogo a que se referem.</w:t>
+        <w:t>15.5  Os prognósticos do mata-mata são enviados digitalmente pelo participante ao organizador (conforme Artigo 3.º) e registados na aplicação. O registo é definitivo e irrevogável após o início do jogo a que se referem.</w:t>
       </w:r>
     </w:p>
     <w:tbl>
@@ -6626,7 +7341,7 @@
           <w:color w:val="1A3A6E"/>
           <w:sz w:val="22"/>
         </w:rPr>
-        <w:t>Artigo 15.º — Alteração de Prognósticos</w:t>
+        <w:t>Artigo 16.º — Alteração de Prognósticos</w:t>
       </w:r>
     </w:p>
     <w:p>
@@ -6756,7 +7471,7 @@
           <w:color w:val="1A3A6E"/>
           <w:sz w:val="22"/>
         </w:rPr>
-        <w:t>Artigo 16.º — Jogos Cancelados, Adiados ou com Resultado Anulado</w:t>
+        <w:t>Artigo 17.º — Jogos Cancelados, Adiados ou com Resultado Anulado</w:t>
       </w:r>
     </w:p>
     <w:p>
@@ -6886,7 +7601,7 @@
           <w:color w:val="1A3A6E"/>
           <w:sz w:val="22"/>
         </w:rPr>
-        <w:t>Artigo 17.º — Conduta e Fair-Play</w:t>
+        <w:t>Artigo 18.º — Conduta e Fair-Play</w:t>
       </w:r>
     </w:p>
     <w:p>
@@ -7136,7 +7851,7 @@
           <w:color w:val="1A3A6E"/>
           <w:sz w:val="22"/>
         </w:rPr>
-        <w:t>Artigo 18.º — Privacidade e Uso dos Dados</w:t>
+        <w:t>Artigo 19.º — Privacidade e Uso dos Dados</w:t>
       </w:r>
     </w:p>
     <w:p>
@@ -7211,7 +7926,7 @@
           <w:color w:val="1A3A6E"/>
           <w:sz w:val="22"/>
         </w:rPr>
-        <w:t>Artigo 19.º — Disposições Finais</w:t>
+        <w:t>Artigo 20.º — Disposições Finais</w:t>
       </w:r>
     </w:p>
     <w:p>

</xml_diff>